<commit_message>
Add hosted app link, LINKS.txt, hosted-mode screenshot script; rebuild report
Co-Authored-By: Claude Sonnet 5.5 <noreply@anthropic.com>
</commit_message>
<xml_diff>
--- a/docs/VeriDoc_Project_Report.docx
+++ b/docs/VeriDoc_Project_Report.docx
@@ -310,7 +310,7 @@
         <w:rPr>
           <w:sz w:val="20"/>
         </w:rPr>
-        <w:t>Live app: [to be added before submission]</w:t>
+        <w:t>Live app: https://veridoc-bgemx43smyhzo9wqhnaibd.streamlit.app</w:t>
       </w:r>
     </w:p>
     <w:p>
@@ -8836,7 +8836,7 @@
               <w:rPr>
                 <w:sz w:val="18"/>
               </w:rPr>
-              <w:t>25 tests pass. Live app: link [to be added before submission]</w:t>
+              <w:t>25 tests pass. Live app: https://veridoc-bgemx43smyhzo9wqhnaibd.streamlit.app</w:t>
             </w:r>
           </w:p>
         </w:tc>
@@ -8989,7 +8989,7 @@
               <w:rPr>
                 <w:sz w:val="20"/>
               </w:rPr>
-              <w:t>[to be added before submission]</w:t>
+              <w:t>https://veridoc-bgemx43smyhzo9wqhnaibd.streamlit.app</w:t>
             </w:r>
           </w:p>
         </w:tc>

</xml_diff>

<commit_message>
Report: Times New Roman, Google Drive link as main link, hosted-app 403 noted; keep callouts together
Co-Authored-By: Claude Sonnet 5.5 <noreply@anthropic.com>
</commit_message>
<xml_diff>
--- a/docs/VeriDoc_Project_Report.docx
+++ b/docs/VeriDoc_Project_Report.docx
@@ -293,35 +293,35 @@
     </w:p>
     <w:p>
       <w:pPr>
-        <w:spacing w:after="20"/>
+        <w:spacing w:after="40"/>
       </w:pPr>
       <w:r>
         <w:rPr>
-          <w:sz w:val="20"/>
+          <w:sz w:val="22"/>
         </w:rPr>
-        <w:t>Source code: https://github.com/AnuruddhaPaul/VeriDoc</w:t>
+        <w:t>Project folder (Google Drive): https://drive.google.com/drive/folders/1CihEMRr5rTfl8hZEFtr6quBrCjBMTXE_</w:t>
       </w:r>
     </w:p>
     <w:p>
       <w:pPr>
-        <w:spacing w:after="20"/>
+        <w:spacing w:after="40"/>
       </w:pPr>
       <w:r>
         <w:rPr>
-          <w:sz w:val="20"/>
+          <w:sz w:val="22"/>
         </w:rPr>
-        <w:t>Live app: https://veridoc-bgemx43smyhzo9wqhnaibd.streamlit.app</w:t>
+        <w:t>Source code (GitHub): https://github.com/AnuruddhaPaul/VeriDoc</w:t>
       </w:r>
     </w:p>
     <w:p>
       <w:pPr>
-        <w:spacing w:after="20"/>
+        <w:spacing w:after="40"/>
       </w:pPr>
       <w:r>
         <w:rPr>
-          <w:sz w:val="20"/>
+          <w:sz w:val="22"/>
         </w:rPr>
-        <w:t>Project folder (Google Drive): [to be added before submission]</w:t>
+        <w:t>Live app: https://veridoc-bgemx43smyhzo9wqhnaibd.streamlit.app</w:t>
       </w:r>
     </w:p>
     <w:p>
@@ -546,6 +546,9 @@
         <w:gridCol w:w="9029"/>
       </w:tblGrid>
       <w:tr>
+        <w:trPr>
+          <w:cantSplit/>
+        </w:trPr>
         <w:tc>
           <w:tcPr>
             <w:tcW w:type="dxa" w:w="9029"/>
@@ -2477,6 +2480,9 @@
         <w:gridCol w:w="9029"/>
       </w:tblGrid>
       <w:tr>
+        <w:trPr>
+          <w:cantSplit/>
+        </w:trPr>
         <w:tc>
           <w:tcPr>
             <w:tcW w:type="dxa" w:w="9029"/>
@@ -7318,6 +7324,9 @@
         <w:gridCol w:w="9029"/>
       </w:tblGrid>
       <w:tr>
+        <w:trPr>
+          <w:cantSplit/>
+        </w:trPr>
         <w:tc>
           <w:tcPr>
             <w:tcW w:type="dxa" w:w="9029"/>
@@ -8294,6 +8303,56 @@
           </w:p>
         </w:tc>
       </w:tr>
+      <w:tr>
+        <w:trPr>
+          <w:cantSplit/>
+        </w:trPr>
+        <w:tc>
+          <w:tcPr>
+            <w:tcW w:type="dxa" w:w="4608"/>
+          </w:tcPr>
+          <w:p>
+            <w:pPr>
+              <w:spacing w:after="40" w:line="252" w:lineRule="auto"/>
+            </w:pPr>
+            <w:r>
+              <w:rPr>
+                <w:sz w:val="18"/>
+              </w:rPr>
+              <w:t>After deploying to Streamlit Community Cloud, my automated browser tests of the hosted app got HTTP 403 (“Access denied. Please check your network settings.”) from Groq on every question, while the same key worked from my computer. This suggests Groq blocks some cloud server addresses.</w:t>
+            </w:r>
+          </w:p>
+        </w:tc>
+        <w:tc>
+          <w:tcPr>
+            <w:tcW w:type="dxa" w:w="4421"/>
+          </w:tcPr>
+          <w:p>
+            <w:pPr>
+              <w:spacing w:after="40" w:line="252" w:lineRule="auto"/>
+            </w:pPr>
+            <w:r>
+              <w:rPr>
+                <w:sz w:val="18"/>
+              </w:rPr>
+              <w:t>Recorded it here rather than hiding it, and prepared a Hugging Face Spaces bundle (</w:t>
+            </w:r>
+            <w:r>
+              <w:rPr>
+                <w:rFonts w:ascii="Consolas" w:hAnsi="Consolas" w:eastAsia="Consolas"/>
+                <w:sz w:val="16"/>
+              </w:rPr>
+              <w:t>deploy/</w:t>
+            </w:r>
+            <w:r>
+              <w:rPr>
+                <w:sz w:val="18"/>
+              </w:rPr>
+              <w:t>) as a fallback host. Anyone reviewing the live app should also check the screenshots in Section 10, which were taken on a local run.</w:t>
+            </w:r>
+          </w:p>
+        </w:tc>
+      </w:tr>
     </w:tbl>
     <w:p>
       <w:pPr>
@@ -8934,9 +8993,9 @@
               <w:rPr>
                 <w:b/>
                 <w:color w:val="2B6CB0"/>
-                <w:sz w:val="20"/>
-              </w:rPr>
-              <w:t>Source code</w:t>
+                <w:sz w:val="22"/>
+              </w:rPr>
+              <w:t>Google Drive folder</w:t>
             </w:r>
           </w:p>
         </w:tc>
@@ -8950,9 +9009,9 @@
             </w:pPr>
             <w:r>
               <w:rPr>
-                <w:sz w:val="20"/>
-              </w:rPr>
-              <w:t>https://github.com/AnuruddhaPaul/VeriDoc</w:t>
+                <w:sz w:val="22"/>
+              </w:rPr>
+              <w:t>https://drive.google.com/drive/folders/1CihEMRr5rTfl8hZEFtr6quBrCjBMTXE_</w:t>
             </w:r>
           </w:p>
         </w:tc>
@@ -8971,9 +9030,9 @@
               <w:rPr>
                 <w:b/>
                 <w:color w:val="2B6CB0"/>
-                <w:sz w:val="20"/>
-              </w:rPr>
-              <w:t>Live app</w:t>
+                <w:sz w:val="22"/>
+              </w:rPr>
+              <w:t>Source code</w:t>
             </w:r>
           </w:p>
         </w:tc>
@@ -8987,9 +9046,9 @@
             </w:pPr>
             <w:r>
               <w:rPr>
-                <w:sz w:val="20"/>
-              </w:rPr>
-              <w:t>https://veridoc-bgemx43smyhzo9wqhnaibd.streamlit.app</w:t>
+                <w:sz w:val="22"/>
+              </w:rPr>
+              <w:t>https://github.com/AnuruddhaPaul/VeriDoc</w:t>
             </w:r>
           </w:p>
         </w:tc>
@@ -9008,9 +9067,9 @@
               <w:rPr>
                 <w:b/>
                 <w:color w:val="2B6CB0"/>
-                <w:sz w:val="20"/>
-              </w:rPr>
-              <w:t>Google Drive folder</w:t>
+                <w:sz w:val="22"/>
+              </w:rPr>
+              <w:t>Live app</w:t>
             </w:r>
           </w:p>
         </w:tc>
@@ -9024,9 +9083,9 @@
             </w:pPr>
             <w:r>
               <w:rPr>
-                <w:sz w:val="20"/>
-              </w:rPr>
-              <w:t>[to be added before submission]</w:t>
+                <w:sz w:val="22"/>
+              </w:rPr>
+              <w:t>https://veridoc-bgemx43smyhzo9wqhnaibd.streamlit.app</w:t>
             </w:r>
           </w:p>
         </w:tc>
@@ -9588,8 +9647,8 @@
       <w:spacing w:after="120" w:line="269" w:lineRule="auto"/>
     </w:pPr>
     <w:rPr>
-      <w:rFonts w:ascii="Calibri" w:hAnsi="Calibri" w:eastAsia="Calibri"/>
-      <w:sz w:val="22"/>
+      <w:rFonts w:ascii="Times New Roman" w:hAnsi="Times New Roman" w:eastAsia="Times New Roman"/>
+      <w:sz w:val="24"/>
     </w:rPr>
   </w:style>
   <w:style w:type="paragraph" w:styleId="Header">

</xml_diff>